<commit_message>
feat: Add comprehensive project documentation, including technical report, presentation slides, and related assets.
</commit_message>
<xml_diff>
--- a/Raport/docs/AMS_Report.docx
+++ b/Raport/docs/AMS_Report.docx
@@ -321,7 +321,7 @@
                 <w:b/>
                 <w:bCs/>
               </w:rPr>
-              <w:t xml:space="preserve">Location:</w:t>
+              <w:t xml:space="preserve">Filière:</w:t>
             </w:r>
           </w:p>
         </w:tc>
@@ -355,7 +355,7 @@
                 <w:b/>
                 <w:bCs/>
               </w:rPr>
-              <w:t xml:space="preserve">Tangier, Morocco</w:t>
+              <w:t xml:space="preserve">Développement Mobile</w:t>
             </w:r>
           </w:p>
         </w:tc>

</xml_diff>

<commit_message>
feat: Add global web use case diagram, project report documentation, and presentation materials.
</commit_message>
<xml_diff>
--- a/Raport/docs/AMS_Report.docx
+++ b/Raport/docs/AMS_Report.docx
@@ -3186,7 +3186,7 @@
       <w:r>
         <w:drawing>
           <wp:inline>
-            <wp:extent cx="5334000" cy="4151652"/>
+            <wp:extent cx="5334000" cy="4135693"/>
             <wp:effectExtent b="0" l="0" r="0" t="0"/>
             <wp:docPr descr="Cas d’Utilisation Global - Plateforme Web" title="" id="65" name="Picture"/>
             <a:graphic>
@@ -3207,7 +3207,7 @@
                   <pic:spPr bwMode="auto">
                     <a:xfrm>
                       <a:off x="0" y="0"/>
-                      <a:ext cx="5334000" cy="4151652"/>
+                      <a:ext cx="5334000" cy="4135693"/>
                     </a:xfrm>
                     <a:prstGeom prst="rect">
                       <a:avLst/>
@@ -3641,7 +3641,7 @@
     <w:bookmarkEnd w:id="80"/>
     <w:bookmarkEnd w:id="81"/>
     <w:bookmarkEnd w:id="82"/>
-    <w:bookmarkStart w:id="89" w:name="branche-technique"/>
+    <w:bookmarkStart w:id="91" w:name="branche-technique"/>
     <w:p>
       <w:pPr>
         <w:pStyle w:val="Heading1"/>
@@ -3659,7 +3659,7 @@
         <w:t xml:space="preserve">🏗️ Branche Technique</w:t>
       </w:r>
     </w:p>
-    <w:bookmarkStart w:id="83" w:name="choix-technologiques"/>
+    <w:bookmarkStart w:id="84" w:name="définition-du-problème-1"/>
     <w:p>
       <w:pPr>
         <w:pStyle w:val="Heading2"/>
@@ -3674,7 +3674,7 @@
         <w:tab/>
       </w:r>
       <w:r>
-        <w:t xml:space="preserve">Choix Technologiques</w:t>
+        <w:t xml:space="preserve">🎯 Définition du Problème</w:t>
       </w:r>
     </w:p>
     <w:p>
@@ -3682,7 +3682,62 @@
         <w:pStyle w:val="FirstParagraph"/>
       </w:pPr>
       <w:r>
-        <w:t xml:space="preserve">Le projet repose sur un écosystème robuste et moderne permettant une scalabilité verticale et horizontale.</w:t>
+        <w:t xml:space="preserve">Le problème majeur réside dans la transition inefficace du</w:t>
+      </w:r>
+      <w:r>
+        <w:t xml:space="preserve"> </w:t>
+      </w:r>
+      <w:r>
+        <w:rPr>
+          <w:b/>
+          <w:bCs/>
+        </w:rPr>
+        <w:t xml:space="preserve">support papier vers la saisie manuelle sur Excel</w:t>
+      </w:r>
+      <w:r>
+        <w:t xml:space="preserve">. Ce processus archaïque génère une surcharge logistique pour les formateurs (devoir segmenter manuellement les sessions 9-11, 11-14, 14-17) et un décalage d’information critique pour l’administration. Le coeur du défi est la suppression de cette</w:t>
+      </w:r>
+      <w:r>
+        <w:t xml:space="preserve"> </w:t>
+      </w:r>
+      <w:r>
+        <w:t xml:space="preserve">“double saisie”</w:t>
+      </w:r>
+      <w:r>
+        <w:t xml:space="preserve"> </w:t>
+      </w:r>
+      <w:r>
+        <w:t xml:space="preserve">par une automatisation directe à la source.</w:t>
+      </w:r>
+    </w:p>
+    <w:bookmarkStart w:id="83" w:name="questions-comment-pourrions-nous-hmw"/>
+    <w:p>
+      <w:pPr>
+        <w:pStyle w:val="Heading3"/>
+      </w:pPr>
+      <w:r>
+        <w:rPr>
+          <w:rStyle w:val="SectionNumber"/>
+        </w:rPr>
+        <w:t xml:space="preserve">8.1.1</w:t>
+      </w:r>
+      <w:r>
+        <w:tab/>
+      </w:r>
+      <w:r>
+        <w:t xml:space="preserve">Questions</w:t>
+      </w:r>
+      <w:r>
+        <w:t xml:space="preserve"> </w:t>
+      </w:r>
+      <w:r>
+        <w:t xml:space="preserve">“Comment pourrions-nous”</w:t>
+      </w:r>
+      <w:r>
+        <w:t xml:space="preserve"> </w:t>
+      </w:r>
+      <w:r>
+        <w:t xml:space="preserve">(HMW)</w:t>
       </w:r>
     </w:p>
     <w:p>
@@ -3698,13 +3753,13 @@
           <w:b/>
           <w:bCs/>
         </w:rPr>
-        <w:t xml:space="preserve">Backend :</w:t>
-      </w:r>
-      <w:r>
-        <w:t xml:space="preserve"> </w:t>
-      </w:r>
-      <w:r>
-        <w:t xml:space="preserve">Laravel 12, offrant un routage puissant, une sécurité intégrée et un ORM (Eloquent) performant.</w:t>
+        <w:t xml:space="preserve">Comment pourrions-nous</w:t>
+      </w:r>
+      <w:r>
+        <w:t xml:space="preserve"> </w:t>
+      </w:r>
+      <w:r>
+        <w:t xml:space="preserve">éliminer le transfert physique des fiches de présence papier de la salle de classe au bureau administratif ?</w:t>
       </w:r>
     </w:p>
     <w:p>
@@ -3720,13 +3775,13 @@
           <w:b/>
           <w:bCs/>
         </w:rPr>
-        <w:t xml:space="preserve">Frontend :</w:t>
-      </w:r>
-      <w:r>
-        <w:t xml:space="preserve"> </w:t>
-      </w:r>
-      <w:r>
-        <w:t xml:space="preserve">Blade Templates pour le rendu côté serveur, combiné à Tailwind CSS pour un design atomique et Alpine.js pour la réactivité.</w:t>
+        <w:t xml:space="preserve">Comment pourrions-nous</w:t>
+      </w:r>
+      <w:r>
+        <w:t xml:space="preserve"> </w:t>
+      </w:r>
+      <w:r>
+        <w:t xml:space="preserve">permettre à l’enseignant de valider chaque session (9-11, 11-14, 14-17) en moins de 30 secondes depuis son smartphone ?</w:t>
       </w:r>
     </w:p>
     <w:p>
@@ -3742,13 +3797,46 @@
           <w:b/>
           <w:bCs/>
         </w:rPr>
-        <w:t xml:space="preserve">Base de données :</w:t>
-      </w:r>
-      <w:r>
-        <w:t xml:space="preserve"> </w:t>
-      </w:r>
-      <w:r>
-        <w:t xml:space="preserve">MySQL gérant les relations complexes entre les sessions, les étudiants et les pointages.</w:t>
+        <w:t xml:space="preserve">Comment pourrions-nous</w:t>
+      </w:r>
+      <w:r>
+        <w:t xml:space="preserve"> </w:t>
+      </w:r>
+      <w:r>
+        <w:t xml:space="preserve">numériser la soumission et l’approbation des notes/justificatifs médicaux ?</w:t>
+      </w:r>
+    </w:p>
+    <w:p>
+      <w:r>
+        <w:br w:type="page"/>
+      </w:r>
+    </w:p>
+    <w:bookmarkEnd w:id="83"/>
+    <w:bookmarkEnd w:id="84"/>
+    <w:bookmarkStart w:id="85" w:name="choix-technologiques"/>
+    <w:p>
+      <w:pPr>
+        <w:pStyle w:val="Heading2"/>
+      </w:pPr>
+      <w:r>
+        <w:rPr>
+          <w:rStyle w:val="SectionNumber"/>
+        </w:rPr>
+        <w:t xml:space="preserve">8.2</w:t>
+      </w:r>
+      <w:r>
+        <w:tab/>
+      </w:r>
+      <w:r>
+        <w:t xml:space="preserve">Choix Technologiques</w:t>
+      </w:r>
+    </w:p>
+    <w:p>
+      <w:pPr>
+        <w:pStyle w:val="FirstParagraph"/>
+      </w:pPr>
+      <w:r>
+        <w:t xml:space="preserve">Le projet repose sur un écosystème robuste et moderne permettant une scalabilité verticale et horizontale.</w:t>
       </w:r>
     </w:p>
     <w:p>
@@ -3756,7 +3844,7 @@
         <w:pStyle w:val="Compact"/>
         <w:numPr>
           <w:ilvl w:val="0"/>
-          <w:numId w:val="1016"/>
+          <w:numId w:val="1017"/>
         </w:numPr>
       </w:pPr>
       <w:r>
@@ -3764,6 +3852,72 @@
           <w:b/>
           <w:bCs/>
         </w:rPr>
+        <w:t xml:space="preserve">Backend :</w:t>
+      </w:r>
+      <w:r>
+        <w:t xml:space="preserve"> </w:t>
+      </w:r>
+      <w:r>
+        <w:t xml:space="preserve">Laravel 12, offrant un routage puissant, une sécurité intégrée et un ORM (Eloquent) performant.</w:t>
+      </w:r>
+    </w:p>
+    <w:p>
+      <w:pPr>
+        <w:pStyle w:val="Compact"/>
+        <w:numPr>
+          <w:ilvl w:val="0"/>
+          <w:numId w:val="1017"/>
+        </w:numPr>
+      </w:pPr>
+      <w:r>
+        <w:rPr>
+          <w:b/>
+          <w:bCs/>
+        </w:rPr>
+        <w:t xml:space="preserve">Frontend :</w:t>
+      </w:r>
+      <w:r>
+        <w:t xml:space="preserve"> </w:t>
+      </w:r>
+      <w:r>
+        <w:t xml:space="preserve">Blade Templates pour le rendu côté serveur, combiné à Tailwind CSS pour un design atomique et Alpine.js pour la réactivité.</w:t>
+      </w:r>
+    </w:p>
+    <w:p>
+      <w:pPr>
+        <w:pStyle w:val="Compact"/>
+        <w:numPr>
+          <w:ilvl w:val="0"/>
+          <w:numId w:val="1017"/>
+        </w:numPr>
+      </w:pPr>
+      <w:r>
+        <w:rPr>
+          <w:b/>
+          <w:bCs/>
+        </w:rPr>
+        <w:t xml:space="preserve">Base de données :</w:t>
+      </w:r>
+      <w:r>
+        <w:t xml:space="preserve"> </w:t>
+      </w:r>
+      <w:r>
+        <w:t xml:space="preserve">MySQL gérant les relations complexes entre les sessions, les étudiants et les pointages.</w:t>
+      </w:r>
+    </w:p>
+    <w:p>
+      <w:pPr>
+        <w:pStyle w:val="Compact"/>
+        <w:numPr>
+          <w:ilvl w:val="0"/>
+          <w:numId w:val="1017"/>
+        </w:numPr>
+      </w:pPr>
+      <w:r>
+        <w:rPr>
+          <w:b/>
+          <w:bCs/>
+        </w:rPr>
         <w:t xml:space="preserve">Outils Externes :</w:t>
       </w:r>
       <w:r>
@@ -3778,8 +3932,8 @@
         <w:br w:type="page"/>
       </w:r>
     </w:p>
-    <w:bookmarkEnd w:id="83"/>
-    <w:bookmarkStart w:id="86" w:name="architecture-du-système"/>
+    <w:bookmarkEnd w:id="85"/>
+    <w:bookmarkStart w:id="88" w:name="architecture-du-système"/>
     <w:p>
       <w:pPr>
         <w:pStyle w:val="Heading2"/>
@@ -3788,7 +3942,7 @@
         <w:rPr>
           <w:rStyle w:val="SectionNumber"/>
         </w:rPr>
-        <w:t xml:space="preserve">8.2</w:t>
+        <w:t xml:space="preserve">8.3</w:t>
       </w:r>
       <w:r>
         <w:tab/>
@@ -3797,7 +3951,7 @@
         <w:t xml:space="preserve">Architecture du Système</w:t>
       </w:r>
     </w:p>
-    <w:bookmarkStart w:id="84" w:name="architecture-mvc"/>
+    <w:bookmarkStart w:id="86" w:name="architecture-mvc"/>
     <w:p>
       <w:pPr>
         <w:pStyle w:val="Heading3"/>
@@ -3806,7 +3960,7 @@
         <w:rPr>
           <w:rStyle w:val="SectionNumber"/>
         </w:rPr>
-        <w:t xml:space="preserve">8.2.1</w:t>
+        <w:t xml:space="preserve">8.3.1</w:t>
       </w:r>
       <w:r>
         <w:tab/>
@@ -3905,8 +4059,8 @@
         <w:t xml:space="preserve">Intermédiaire traitant les requêtes et orchestrant les réponses.</w:t>
       </w:r>
     </w:p>
-    <w:bookmarkEnd w:id="84"/>
-    <w:bookmarkStart w:id="85" w:name="architecture-en-3-couches-3-tier"/>
+    <w:bookmarkEnd w:id="86"/>
+    <w:bookmarkStart w:id="87" w:name="architecture-en-3-couches-3-tier"/>
     <w:p>
       <w:pPr>
         <w:pStyle w:val="Heading3"/>
@@ -3915,7 +4069,7 @@
         <w:rPr>
           <w:rStyle w:val="SectionNumber"/>
         </w:rPr>
-        <w:t xml:space="preserve">8.2.2</w:t>
+        <w:t xml:space="preserve">8.3.2</w:t>
       </w:r>
       <w:r>
         <w:tab/>
@@ -3996,222 +4150,6 @@
       </w:r>
       <w:r>
         <w:t xml:space="preserve">Serveur de base de données MySQL.</w:t>
-      </w:r>
-    </w:p>
-    <w:p>
-      <w:r>
-        <w:br w:type="page"/>
-      </w:r>
-    </w:p>
-    <w:bookmarkEnd w:id="85"/>
-    <w:bookmarkEnd w:id="86"/>
-    <w:bookmarkStart w:id="88" w:name="prototype-fonctionnalités-classes"/>
-    <w:p>
-      <w:pPr>
-        <w:pStyle w:val="Heading2"/>
-      </w:pPr>
-      <w:r>
-        <w:rPr>
-          <w:rStyle w:val="SectionNumber"/>
-        </w:rPr>
-        <w:t xml:space="preserve">8.3</w:t>
-      </w:r>
-      <w:r>
-        <w:tab/>
-      </w:r>
-      <w:r>
-        <w:t xml:space="preserve">Prototype (Fonctionnalités &amp; Classes)</w:t>
-      </w:r>
-    </w:p>
-    <w:p>
-      <w:pPr>
-        <w:pStyle w:val="FirstParagraph"/>
-      </w:pPr>
-      <w:r>
-        <w:t xml:space="preserve">Le prototype d’</w:t>
-      </w:r>
-      <w:r>
-        <w:rPr>
-          <w:b/>
-          <w:bCs/>
-        </w:rPr>
-        <w:t xml:space="preserve">AttendanceFlow-AMS</w:t>
-      </w:r>
-      <w:r>
-        <w:t xml:space="preserve"> </w:t>
-      </w:r>
-      <w:r>
-        <w:t xml:space="preserve">couvre les flux critiques :</w:t>
-      </w:r>
-      <w:r>
-        <w:t xml:space="preserve"> </w:t>
-      </w:r>
-      <w:r>
-        <w:t xml:space="preserve">-</w:t>
-      </w:r>
-      <w:r>
-        <w:t xml:space="preserve"> </w:t>
-      </w:r>
-      <w:r>
-        <w:rPr>
-          <w:b/>
-          <w:bCs/>
-        </w:rPr>
-        <w:t xml:space="preserve">Section Administrateur :</w:t>
-      </w:r>
-      <w:r>
-        <w:t xml:space="preserve"> </w:t>
-      </w:r>
-      <w:r>
-        <w:t xml:space="preserve">Dashboard, gestion des étudiants, validation des justificatifs.</w:t>
-      </w:r>
-      <w:r>
-        <w:t xml:space="preserve"> </w:t>
-      </w:r>
-      <w:r>
-        <w:t xml:space="preserve">-</w:t>
-      </w:r>
-      <w:r>
-        <w:t xml:space="preserve"> </w:t>
-      </w:r>
-      <w:r>
-        <w:rPr>
-          <w:b/>
-          <w:bCs/>
-        </w:rPr>
-        <w:t xml:space="preserve">Section Formateur :</w:t>
-      </w:r>
-      <w:r>
-        <w:t xml:space="preserve"> </w:t>
-      </w:r>
-      <w:r>
-        <w:t xml:space="preserve">Pointage par session (Flash), gestion des retards.</w:t>
-      </w:r>
-      <w:r>
-        <w:t xml:space="preserve"> </w:t>
-      </w:r>
-      <w:r>
-        <w:t xml:space="preserve">-</w:t>
-      </w:r>
-      <w:r>
-        <w:t xml:space="preserve"> </w:t>
-      </w:r>
-      <w:r>
-        <w:rPr>
-          <w:b/>
-          <w:bCs/>
-        </w:rPr>
-        <w:t xml:space="preserve">Section Étudiant :</w:t>
-      </w:r>
-      <w:r>
-        <w:t xml:space="preserve"> </w:t>
-      </w:r>
-      <w:r>
-        <w:t xml:space="preserve">Consultation de l’assiduité, soumission de documents.</w:t>
-      </w:r>
-    </w:p>
-    <w:bookmarkStart w:id="87" w:name="diagramme-de-classe-entités-principales"/>
-    <w:p>
-      <w:pPr>
-        <w:pStyle w:val="Heading3"/>
-      </w:pPr>
-      <w:r>
-        <w:rPr>
-          <w:rStyle w:val="SectionNumber"/>
-        </w:rPr>
-        <w:t xml:space="preserve">8.3.1</w:t>
-      </w:r>
-      <w:r>
-        <w:tab/>
-      </w:r>
-      <w:r>
-        <w:t xml:space="preserve">Diagramme de Classe — Entités Principales</w:t>
-      </w:r>
-    </w:p>
-    <w:p>
-      <w:pPr>
-        <w:pStyle w:val="FirstParagraph"/>
-      </w:pPr>
-      <w:r>
-        <w:t xml:space="preserve">Les entités</w:t>
-      </w:r>
-      <w:r>
-        <w:t xml:space="preserve"> </w:t>
-      </w:r>
-      <w:r>
-        <w:rPr>
-          <w:rStyle w:val="VerbatimChar"/>
-        </w:rPr>
-        <w:t xml:space="preserve">User</w:t>
-      </w:r>
-      <w:r>
-        <w:t xml:space="preserve">,</w:t>
-      </w:r>
-      <w:r>
-        <w:t xml:space="preserve"> </w:t>
-      </w:r>
-      <w:r>
-        <w:rPr>
-          <w:rStyle w:val="VerbatimChar"/>
-        </w:rPr>
-        <w:t xml:space="preserve">Student</w:t>
-      </w:r>
-      <w:r>
-        <w:t xml:space="preserve">,</w:t>
-      </w:r>
-      <w:r>
-        <w:t xml:space="preserve"> </w:t>
-      </w:r>
-      <w:r>
-        <w:rPr>
-          <w:rStyle w:val="VerbatimChar"/>
-        </w:rPr>
-        <w:t xml:space="preserve">Teacher</w:t>
-      </w:r>
-      <w:r>
-        <w:t xml:space="preserve">,</w:t>
-      </w:r>
-      <w:r>
-        <w:t xml:space="preserve"> </w:t>
-      </w:r>
-      <w:r>
-        <w:rPr>
-          <w:rStyle w:val="VerbatimChar"/>
-        </w:rPr>
-        <w:t xml:space="preserve">Session</w:t>
-      </w:r>
-      <w:r>
-        <w:t xml:space="preserve">,</w:t>
-      </w:r>
-      <w:r>
-        <w:t xml:space="preserve"> </w:t>
-      </w:r>
-      <w:r>
-        <w:rPr>
-          <w:rStyle w:val="VerbatimChar"/>
-        </w:rPr>
-        <w:t xml:space="preserve">Attendance</w:t>
-      </w:r>
-      <w:r>
-        <w:t xml:space="preserve"> </w:t>
-      </w:r>
-      <w:r>
-        <w:t xml:space="preserve">et</w:t>
-      </w:r>
-      <w:r>
-        <w:t xml:space="preserve"> </w:t>
-      </w:r>
-      <w:r>
-        <w:rPr>
-          <w:rStyle w:val="VerbatimChar"/>
-        </w:rPr>
-        <w:t xml:space="preserve">Justification</w:t>
-      </w:r>
-      <w:r>
-        <w:t xml:space="preserve"> </w:t>
-      </w:r>
-      <w:r>
-        <w:t xml:space="preserve">forment le squelette du système, garantissant une intégrité référentielle stricte.</w:t>
       </w:r>
     </w:p>
     <w:p>
@@ -4221,8 +4159,224 @@
     </w:p>
     <w:bookmarkEnd w:id="87"/>
     <w:bookmarkEnd w:id="88"/>
+    <w:bookmarkStart w:id="90" w:name="prototype-fonctionnalités-classes"/>
+    <w:p>
+      <w:pPr>
+        <w:pStyle w:val="Heading2"/>
+      </w:pPr>
+      <w:r>
+        <w:rPr>
+          <w:rStyle w:val="SectionNumber"/>
+        </w:rPr>
+        <w:t xml:space="preserve">8.4</w:t>
+      </w:r>
+      <w:r>
+        <w:tab/>
+      </w:r>
+      <w:r>
+        <w:t xml:space="preserve">Prototype (Fonctionnalités &amp; Classes)</w:t>
+      </w:r>
+    </w:p>
+    <w:p>
+      <w:pPr>
+        <w:pStyle w:val="FirstParagraph"/>
+      </w:pPr>
+      <w:r>
+        <w:t xml:space="preserve">Le prototype d’</w:t>
+      </w:r>
+      <w:r>
+        <w:rPr>
+          <w:b/>
+          <w:bCs/>
+        </w:rPr>
+        <w:t xml:space="preserve">AttendanceFlow-AMS</w:t>
+      </w:r>
+      <w:r>
+        <w:t xml:space="preserve"> </w:t>
+      </w:r>
+      <w:r>
+        <w:t xml:space="preserve">couvre les flux critiques :</w:t>
+      </w:r>
+      <w:r>
+        <w:t xml:space="preserve"> </w:t>
+      </w:r>
+      <w:r>
+        <w:t xml:space="preserve">-</w:t>
+      </w:r>
+      <w:r>
+        <w:t xml:space="preserve"> </w:t>
+      </w:r>
+      <w:r>
+        <w:rPr>
+          <w:b/>
+          <w:bCs/>
+        </w:rPr>
+        <w:t xml:space="preserve">Section Administrateur :</w:t>
+      </w:r>
+      <w:r>
+        <w:t xml:space="preserve"> </w:t>
+      </w:r>
+      <w:r>
+        <w:t xml:space="preserve">Dashboard, gestion des étudiants, validation des justificatifs.</w:t>
+      </w:r>
+      <w:r>
+        <w:t xml:space="preserve"> </w:t>
+      </w:r>
+      <w:r>
+        <w:t xml:space="preserve">-</w:t>
+      </w:r>
+      <w:r>
+        <w:t xml:space="preserve"> </w:t>
+      </w:r>
+      <w:r>
+        <w:rPr>
+          <w:b/>
+          <w:bCs/>
+        </w:rPr>
+        <w:t xml:space="preserve">Section Formateur :</w:t>
+      </w:r>
+      <w:r>
+        <w:t xml:space="preserve"> </w:t>
+      </w:r>
+      <w:r>
+        <w:t xml:space="preserve">Pointage par session (Flash), gestion des retards.</w:t>
+      </w:r>
+      <w:r>
+        <w:t xml:space="preserve"> </w:t>
+      </w:r>
+      <w:r>
+        <w:t xml:space="preserve">-</w:t>
+      </w:r>
+      <w:r>
+        <w:t xml:space="preserve"> </w:t>
+      </w:r>
+      <w:r>
+        <w:rPr>
+          <w:b/>
+          <w:bCs/>
+        </w:rPr>
+        <w:t xml:space="preserve">Section Étudiant :</w:t>
+      </w:r>
+      <w:r>
+        <w:t xml:space="preserve"> </w:t>
+      </w:r>
+      <w:r>
+        <w:t xml:space="preserve">Consultation de l’assiduité, soumission de documents.</w:t>
+      </w:r>
+    </w:p>
+    <w:bookmarkStart w:id="89" w:name="diagramme-de-classe-entités-principales"/>
+    <w:p>
+      <w:pPr>
+        <w:pStyle w:val="Heading3"/>
+      </w:pPr>
+      <w:r>
+        <w:rPr>
+          <w:rStyle w:val="SectionNumber"/>
+        </w:rPr>
+        <w:t xml:space="preserve">8.4.1</w:t>
+      </w:r>
+      <w:r>
+        <w:tab/>
+      </w:r>
+      <w:r>
+        <w:t xml:space="preserve">Diagramme de Classe — Entités Principales</w:t>
+      </w:r>
+    </w:p>
+    <w:p>
+      <w:pPr>
+        <w:pStyle w:val="FirstParagraph"/>
+      </w:pPr>
+      <w:r>
+        <w:t xml:space="preserve">Les entités</w:t>
+      </w:r>
+      <w:r>
+        <w:t xml:space="preserve"> </w:t>
+      </w:r>
+      <w:r>
+        <w:rPr>
+          <w:rStyle w:val="VerbatimChar"/>
+        </w:rPr>
+        <w:t xml:space="preserve">User</w:t>
+      </w:r>
+      <w:r>
+        <w:t xml:space="preserve">,</w:t>
+      </w:r>
+      <w:r>
+        <w:t xml:space="preserve"> </w:t>
+      </w:r>
+      <w:r>
+        <w:rPr>
+          <w:rStyle w:val="VerbatimChar"/>
+        </w:rPr>
+        <w:t xml:space="preserve">Student</w:t>
+      </w:r>
+      <w:r>
+        <w:t xml:space="preserve">,</w:t>
+      </w:r>
+      <w:r>
+        <w:t xml:space="preserve"> </w:t>
+      </w:r>
+      <w:r>
+        <w:rPr>
+          <w:rStyle w:val="VerbatimChar"/>
+        </w:rPr>
+        <w:t xml:space="preserve">Teacher</w:t>
+      </w:r>
+      <w:r>
+        <w:t xml:space="preserve">,</w:t>
+      </w:r>
+      <w:r>
+        <w:t xml:space="preserve"> </w:t>
+      </w:r>
+      <w:r>
+        <w:rPr>
+          <w:rStyle w:val="VerbatimChar"/>
+        </w:rPr>
+        <w:t xml:space="preserve">Session</w:t>
+      </w:r>
+      <w:r>
+        <w:t xml:space="preserve">,</w:t>
+      </w:r>
+      <w:r>
+        <w:t xml:space="preserve"> </w:t>
+      </w:r>
+      <w:r>
+        <w:rPr>
+          <w:rStyle w:val="VerbatimChar"/>
+        </w:rPr>
+        <w:t xml:space="preserve">Attendance</w:t>
+      </w:r>
+      <w:r>
+        <w:t xml:space="preserve"> </w:t>
+      </w:r>
+      <w:r>
+        <w:t xml:space="preserve">et</w:t>
+      </w:r>
+      <w:r>
+        <w:t xml:space="preserve"> </w:t>
+      </w:r>
+      <w:r>
+        <w:rPr>
+          <w:rStyle w:val="VerbatimChar"/>
+        </w:rPr>
+        <w:t xml:space="preserve">Justification</w:t>
+      </w:r>
+      <w:r>
+        <w:t xml:space="preserve"> </w:t>
+      </w:r>
+      <w:r>
+        <w:t xml:space="preserve">forment le squelette du système, garantissant une intégrité référentielle stricte.</w:t>
+      </w:r>
+    </w:p>
+    <w:p>
+      <w:r>
+        <w:br w:type="page"/>
+      </w:r>
+    </w:p>
     <w:bookmarkEnd w:id="89"/>
-    <w:bookmarkStart w:id="103" w:name="conception-ui-design"/>
+    <w:bookmarkEnd w:id="90"/>
+    <w:bookmarkEnd w:id="91"/>
+    <w:bookmarkStart w:id="105" w:name="conception-ui-design"/>
     <w:p>
       <w:pPr>
         <w:pStyle w:val="Heading1"/>
@@ -4240,7 +4394,7 @@
         <w:t xml:space="preserve">🎨 Conception &amp; UI Design</w:t>
       </w:r>
     </w:p>
-    <w:bookmarkStart w:id="93" w:name="diagramme-de-classe"/>
+    <w:bookmarkStart w:id="95" w:name="diagramme-de-classe"/>
     <w:p>
       <w:pPr>
         <w:pStyle w:val="Heading2"/>
@@ -4275,18 +4429,18 @@
           <wp:inline>
             <wp:extent cx="5334000" cy="3775021"/>
             <wp:effectExtent b="0" l="0" r="0" t="0"/>
-            <wp:docPr descr="Diagramme de Classe" title="" id="91" name="Picture"/>
+            <wp:docPr descr="Diagramme de Classe" title="" id="93" name="Picture"/>
             <a:graphic>
               <a:graphicData uri="http://schemas.openxmlformats.org/drawingml/2006/picture">
                 <pic:pic>
                   <pic:nvPicPr>
-                    <pic:cNvPr descr="imgs/diagramme-class.png" id="92" name="Picture"/>
+                    <pic:cNvPr descr="imgs/diagramme-class.png" id="94" name="Picture"/>
                     <pic:cNvPicPr>
                       <a:picLocks noChangeArrowheads="1" noChangeAspect="1"/>
                     </pic:cNvPicPr>
                   </pic:nvPicPr>
                   <pic:blipFill>
-                    <a:blip r:embed="rId90"/>
+                    <a:blip r:embed="rId92"/>
                     <a:stretch>
                       <a:fillRect/>
                     </a:stretch>
@@ -4326,8 +4480,8 @@
         <w:br w:type="page"/>
       </w:r>
     </w:p>
-    <w:bookmarkEnd w:id="93"/>
-    <w:bookmarkStart w:id="102" w:name="schéma-des-interfaces-maquette-uiux"/>
+    <w:bookmarkEnd w:id="95"/>
+    <w:bookmarkStart w:id="104" w:name="schéma-des-interfaces-maquette-uiux"/>
     <w:p>
       <w:pPr>
         <w:pStyle w:val="Heading2"/>
@@ -4353,7 +4507,7 @@
         <w:t xml:space="preserve">La conception visuelle repose sur une approche premium et responsive, utilisant Tailwind CSS pour garantir une expérience fluide sur tous les terminaux.</w:t>
       </w:r>
     </w:p>
-    <w:bookmarkStart w:id="97" w:name="X8c287fb9f60d08483f6c2fdfd0570b52bcce690"/>
+    <w:bookmarkStart w:id="99" w:name="X8c287fb9f60d08483f6c2fdfd0570b52bcce690"/>
     <w:p>
       <w:pPr>
         <w:pStyle w:val="Heading3"/>
@@ -4380,18 +4534,18 @@
           <wp:inline>
             <wp:extent cx="5334000" cy="2855912"/>
             <wp:effectExtent b="0" l="0" r="0" t="0"/>
-            <wp:docPr descr="Maquette UI - Dashboard Admin" title="" id="95" name="Picture"/>
+            <wp:docPr descr="Maquette UI - Dashboard Admin" title="" id="97" name="Picture"/>
             <a:graphic>
               <a:graphicData uri="http://schemas.openxmlformats.org/drawingml/2006/picture">
                 <pic:pic>
                   <pic:nvPicPr>
-                    <pic:cNvPr descr="imgs/maquette.png" id="96" name="Picture"/>
+                    <pic:cNvPr descr="imgs/maquette.png" id="98" name="Picture"/>
                     <pic:cNvPicPr>
                       <a:picLocks noChangeArrowheads="1" noChangeAspect="1"/>
                     </pic:cNvPicPr>
                   </pic:nvPicPr>
                   <pic:blipFill>
-                    <a:blip r:embed="rId94"/>
+                    <a:blip r:embed="rId96"/>
                     <a:stretch>
                       <a:fillRect/>
                     </a:stretch>
@@ -4426,8 +4580,8 @@
         <w:t xml:space="preserve">Maquette UI - Dashboard Admin</w:t>
       </w:r>
     </w:p>
-    <w:bookmarkEnd w:id="97"/>
-    <w:bookmarkStart w:id="101" w:name="vue-densemble---application-mobile"/>
+    <w:bookmarkEnd w:id="99"/>
+    <w:bookmarkStart w:id="103" w:name="vue-densemble---application-mobile"/>
     <w:p>
       <w:pPr>
         <w:pStyle w:val="Heading3"/>
@@ -4454,18 +4608,18 @@
           <wp:inline>
             <wp:extent cx="5334000" cy="3214290"/>
             <wp:effectExtent b="0" l="0" r="0" t="0"/>
-            <wp:docPr descr="Maquette UI - Application Mobile" title="" id="99" name="Picture"/>
+            <wp:docPr descr="Maquette UI - Application Mobile" title="" id="101" name="Picture"/>
             <a:graphic>
               <a:graphicData uri="http://schemas.openxmlformats.org/drawingml/2006/picture">
                 <pic:pic>
                   <pic:nvPicPr>
-                    <pic:cNvPr descr="imgs/maquete-m.png" id="100" name="Picture"/>
+                    <pic:cNvPr descr="imgs/maquete-m.png" id="102" name="Picture"/>
                     <pic:cNvPicPr>
                       <a:picLocks noChangeArrowheads="1" noChangeAspect="1"/>
                     </pic:cNvPicPr>
                   </pic:nvPicPr>
                   <pic:blipFill>
-                    <a:blip r:embed="rId98"/>
+                    <a:blip r:embed="rId100"/>
                     <a:stretch>
                       <a:fillRect/>
                     </a:stretch>
@@ -4505,10 +4659,10 @@
         <w:br w:type="page"/>
       </w:r>
     </w:p>
-    <w:bookmarkEnd w:id="101"/>
-    <w:bookmarkEnd w:id="102"/>
     <w:bookmarkEnd w:id="103"/>
-    <w:bookmarkStart w:id="106" w:name="réalisation"/>
+    <w:bookmarkEnd w:id="104"/>
+    <w:bookmarkEnd w:id="105"/>
+    <w:bookmarkStart w:id="108" w:name="réalisation"/>
     <w:p>
       <w:pPr>
         <w:pStyle w:val="Heading1"/>
@@ -4526,7 +4680,7 @@
         <w:t xml:space="preserve">💻 Réalisation</w:t>
       </w:r>
     </w:p>
-    <w:bookmarkStart w:id="104" w:name="technologies-utilisées-tech-stack"/>
+    <w:bookmarkStart w:id="106" w:name="technologies-utilisées-tech-stack"/>
     <w:p>
       <w:pPr>
         <w:pStyle w:val="Heading2"/>
@@ -4550,118 +4704,6 @@
       </w:pPr>
       <w:r>
         <w:t xml:space="preserve">Le projet utilise des technologies de pointe pour offrir une interface premium et une architecture solide :</w:t>
-      </w:r>
-    </w:p>
-    <w:p>
-      <w:pPr>
-        <w:pStyle w:val="Compact"/>
-        <w:numPr>
-          <w:ilvl w:val="0"/>
-          <w:numId w:val="1017"/>
-        </w:numPr>
-      </w:pPr>
-      <w:r>
-        <w:rPr>
-          <w:b/>
-          <w:bCs/>
-        </w:rPr>
-        <w:t xml:space="preserve">Frontend :</w:t>
-      </w:r>
-      <w:r>
-        <w:t xml:space="preserve"> </w:t>
-      </w:r>
-      <w:r>
-        <w:t xml:space="preserve">Blade Templates, Tailwind CSS pour le style, et Alpine.js pour l’interactivité dynamique.</w:t>
-      </w:r>
-    </w:p>
-    <w:p>
-      <w:pPr>
-        <w:pStyle w:val="Compact"/>
-        <w:numPr>
-          <w:ilvl w:val="0"/>
-          <w:numId w:val="1017"/>
-        </w:numPr>
-      </w:pPr>
-      <w:r>
-        <w:rPr>
-          <w:b/>
-          <w:bCs/>
-        </w:rPr>
-        <w:t xml:space="preserve">Backend :</w:t>
-      </w:r>
-      <w:r>
-        <w:t xml:space="preserve"> </w:t>
-      </w:r>
-      <w:r>
-        <w:t xml:space="preserve">Laravel 12 (PHP 8.2+) gérant la logique métier, l’authentification et les accès.</w:t>
-      </w:r>
-    </w:p>
-    <w:p>
-      <w:pPr>
-        <w:pStyle w:val="Compact"/>
-        <w:numPr>
-          <w:ilvl w:val="0"/>
-          <w:numId w:val="1017"/>
-        </w:numPr>
-      </w:pPr>
-      <w:r>
-        <w:rPr>
-          <w:b/>
-          <w:bCs/>
-        </w:rPr>
-        <w:t xml:space="preserve">Base de Données :</w:t>
-      </w:r>
-      <w:r>
-        <w:t xml:space="preserve"> </w:t>
-      </w:r>
-      <w:r>
-        <w:t xml:space="preserve">MySQL pour le stockage relationnel des données d’assiduité.</w:t>
-      </w:r>
-    </w:p>
-    <w:p>
-      <w:pPr>
-        <w:pStyle w:val="Compact"/>
-        <w:numPr>
-          <w:ilvl w:val="0"/>
-          <w:numId w:val="1017"/>
-        </w:numPr>
-      </w:pPr>
-      <w:r>
-        <w:rPr>
-          <w:b/>
-          <w:bCs/>
-        </w:rPr>
-        <w:t xml:space="preserve">Composants UI :</w:t>
-      </w:r>
-      <w:r>
-        <w:t xml:space="preserve"> </w:t>
-      </w:r>
-      <w:r>
-        <w:t xml:space="preserve">Preline UI et Lucide Icons pour des interfaces professionnelles et claires.</w:t>
-      </w:r>
-    </w:p>
-    <w:p>
-      <w:r>
-        <w:br w:type="page"/>
-      </w:r>
-    </w:p>
-    <w:bookmarkEnd w:id="104"/>
-    <w:bookmarkStart w:id="105" w:name="outils-de-développement-gestion"/>
-    <w:p>
-      <w:pPr>
-        <w:pStyle w:val="Heading2"/>
-      </w:pPr>
-      <w:r>
-        <w:rPr>
-          <w:rStyle w:val="SectionNumber"/>
-        </w:rPr>
-        <w:t xml:space="preserve">10.2</w:t>
-      </w:r>
-      <w:r>
-        <w:tab/>
-      </w:r>
-      <w:r>
-        <w:t xml:space="preserve">Outils de développement &amp; Gestion</w:t>
       </w:r>
     </w:p>
     <w:p>
@@ -4677,29 +4719,13 @@
           <w:b/>
           <w:bCs/>
         </w:rPr>
-        <w:t xml:space="preserve">IDE :</w:t>
-      </w:r>
-      <w:r>
-        <w:t xml:space="preserve"> </w:t>
-      </w:r>
-      <w:r>
-        <w:t xml:space="preserve">Visual Studio Code avec l’assistant IA</w:t>
-      </w:r>
-      <w:r>
-        <w:t xml:space="preserve"> </w:t>
-      </w:r>
-      <w:r>
-        <w:rPr>
-          <w:b/>
-          <w:bCs/>
-        </w:rPr>
-        <w:t xml:space="preserve">Antigravity</w:t>
-      </w:r>
-      <w:r>
-        <w:t xml:space="preserve"> </w:t>
-      </w:r>
-      <w:r>
-        <w:t xml:space="preserve">pour l’accélération du développement.</w:t>
+        <w:t xml:space="preserve">Frontend :</w:t>
+      </w:r>
+      <w:r>
+        <w:t xml:space="preserve"> </w:t>
+      </w:r>
+      <w:r>
+        <w:t xml:space="preserve">Blade Templates, Tailwind CSS pour le style, et Alpine.js pour l’interactivité dynamique.</w:t>
       </w:r>
     </w:p>
     <w:p>
@@ -4715,13 +4741,13 @@
           <w:b/>
           <w:bCs/>
         </w:rPr>
-        <w:t xml:space="preserve">Gestion de Version :</w:t>
-      </w:r>
-      <w:r>
-        <w:t xml:space="preserve"> </w:t>
-      </w:r>
-      <w:r>
-        <w:t xml:space="preserve">Git et GitHub pour le suivi du code source.</w:t>
+        <w:t xml:space="preserve">Backend :</w:t>
+      </w:r>
+      <w:r>
+        <w:t xml:space="preserve"> </w:t>
+      </w:r>
+      <w:r>
+        <w:t xml:space="preserve">Laravel 12 (PHP 8.2+) gérant la logique métier, l’authentification et les accès.</w:t>
       </w:r>
     </w:p>
     <w:p>
@@ -4737,29 +4763,13 @@
           <w:b/>
           <w:bCs/>
         </w:rPr>
-        <w:t xml:space="preserve">Gestion de Projet :</w:t>
-      </w:r>
-      <w:r>
-        <w:t xml:space="preserve"> </w:t>
-      </w:r>
-      <w:r>
-        <w:t xml:space="preserve">Méthodologie</w:t>
-      </w:r>
-      <w:r>
-        <w:t xml:space="preserve"> </w:t>
-      </w:r>
-      <w:r>
-        <w:rPr>
-          <w:b/>
-          <w:bCs/>
-        </w:rPr>
-        <w:t xml:space="preserve">Scrum</w:t>
-      </w:r>
-      <w:r>
-        <w:t xml:space="preserve"> </w:t>
-      </w:r>
-      <w:r>
-        <w:t xml:space="preserve">avec utilisation d’artéfacts Agiles (Sprints, Backlog).</w:t>
+        <w:t xml:space="preserve">Base de Données :</w:t>
+      </w:r>
+      <w:r>
+        <w:t xml:space="preserve"> </w:t>
+      </w:r>
+      <w:r>
+        <w:t xml:space="preserve">MySQL pour le stockage relationnel des données d’assiduité.</w:t>
       </w:r>
     </w:p>
     <w:p>
@@ -4775,13 +4785,13 @@
           <w:b/>
           <w:bCs/>
         </w:rPr>
-        <w:t xml:space="preserve">Conception :</w:t>
-      </w:r>
-      <w:r>
-        <w:t xml:space="preserve"> </w:t>
-      </w:r>
-      <w:r>
-        <w:t xml:space="preserve">PlantUML pour les diagrammes de cas d’utilisation et de classe.</w:t>
+        <w:t xml:space="preserve">Composants UI :</w:t>
+      </w:r>
+      <w:r>
+        <w:t xml:space="preserve"> </w:t>
+      </w:r>
+      <w:r>
+        <w:t xml:space="preserve">Preline UI et Lucide Icons pour des interfaces professionnelles et claires.</w:t>
       </w:r>
     </w:p>
     <w:p>
@@ -4789,61 +4799,23 @@
         <w:br w:type="page"/>
       </w:r>
     </w:p>
-    <w:bookmarkEnd w:id="105"/>
     <w:bookmarkEnd w:id="106"/>
-    <w:bookmarkStart w:id="107" w:name="conclusion"/>
-    <w:p>
-      <w:pPr>
-        <w:pStyle w:val="Heading1"/>
+    <w:bookmarkStart w:id="107" w:name="outils-de-développement-gestion"/>
+    <w:p>
+      <w:pPr>
+        <w:pStyle w:val="Heading2"/>
       </w:pPr>
       <w:r>
         <w:rPr>
           <w:rStyle w:val="SectionNumber"/>
         </w:rPr>
-        <w:t xml:space="preserve">11</w:t>
+        <w:t xml:space="preserve">10.2</w:t>
       </w:r>
       <w:r>
         <w:tab/>
       </w:r>
       <w:r>
-        <w:t xml:space="preserve">⭐ Conclusion</w:t>
-      </w:r>
-    </w:p>
-    <w:p>
-      <w:pPr>
-        <w:pStyle w:val="FirstParagraph"/>
-      </w:pPr>
-      <w:r>
-        <w:t xml:space="preserve">Le projet</w:t>
-      </w:r>
-      <w:r>
-        <w:t xml:space="preserve"> </w:t>
-      </w:r>
-      <w:r>
-        <w:rPr>
-          <w:b/>
-          <w:bCs/>
-        </w:rPr>
-        <w:t xml:space="preserve">AttendanceFlow-AMS</w:t>
-      </w:r>
-      <w:r>
-        <w:t xml:space="preserve"> </w:t>
-      </w:r>
-      <w:r>
-        <w:t xml:space="preserve">a permis de répondre efficacement aux défis de la gestion des absences au sein de</w:t>
-      </w:r>
-      <w:r>
-        <w:t xml:space="preserve"> </w:t>
-      </w:r>
-      <w:r>
-        <w:rPr>
-          <w:b/>
-          <w:bCs/>
-        </w:rPr>
-        <w:t xml:space="preserve">SoliCode</w:t>
-      </w:r>
-      <w:r>
-        <w:t xml:space="preserve">. En remplaçant les processus manuels par une solution numérique intégrée (Web &amp; Mobile), nous avons atteint les objectifs de :</w:t>
+        <w:t xml:space="preserve">Outils de développement &amp; Gestion</w:t>
       </w:r>
     </w:p>
     <w:p>
@@ -4859,13 +4831,29 @@
           <w:b/>
           <w:bCs/>
         </w:rPr>
-        <w:t xml:space="preserve">Fiabilité :</w:t>
-      </w:r>
-      <w:r>
-        <w:t xml:space="preserve"> </w:t>
-      </w:r>
-      <w:r>
-        <w:t xml:space="preserve">Suppression des erreurs de saisie et centralisation de l’information.</w:t>
+        <w:t xml:space="preserve">IDE :</w:t>
+      </w:r>
+      <w:r>
+        <w:t xml:space="preserve"> </w:t>
+      </w:r>
+      <w:r>
+        <w:t xml:space="preserve">Visual Studio Code avec l’assistant IA</w:t>
+      </w:r>
+      <w:r>
+        <w:t xml:space="preserve"> </w:t>
+      </w:r>
+      <w:r>
+        <w:rPr>
+          <w:b/>
+          <w:bCs/>
+        </w:rPr>
+        <w:t xml:space="preserve">Antigravity</w:t>
+      </w:r>
+      <w:r>
+        <w:t xml:space="preserve"> </w:t>
+      </w:r>
+      <w:r>
+        <w:t xml:space="preserve">pour l’accélération du développement.</w:t>
       </w:r>
     </w:p>
     <w:p>
@@ -4881,13 +4869,13 @@
           <w:b/>
           <w:bCs/>
         </w:rPr>
-        <w:t xml:space="preserve">Productivité :</w:t>
-      </w:r>
-      <w:r>
-        <w:t xml:space="preserve"> </w:t>
-      </w:r>
-      <w:r>
-        <w:t xml:space="preserve">Gain de temps significatif pour les formateurs et l’administration.</w:t>
+        <w:t xml:space="preserve">Gestion de Version :</w:t>
+      </w:r>
+      <w:r>
+        <w:t xml:space="preserve"> </w:t>
+      </w:r>
+      <w:r>
+        <w:t xml:space="preserve">Git et GitHub pour le suivi du code source.</w:t>
       </w:r>
     </w:p>
     <w:p>
@@ -4903,6 +4891,172 @@
           <w:b/>
           <w:bCs/>
         </w:rPr>
+        <w:t xml:space="preserve">Gestion de Projet :</w:t>
+      </w:r>
+      <w:r>
+        <w:t xml:space="preserve"> </w:t>
+      </w:r>
+      <w:r>
+        <w:t xml:space="preserve">Méthodologie</w:t>
+      </w:r>
+      <w:r>
+        <w:t xml:space="preserve"> </w:t>
+      </w:r>
+      <w:r>
+        <w:rPr>
+          <w:b/>
+          <w:bCs/>
+        </w:rPr>
+        <w:t xml:space="preserve">Scrum</w:t>
+      </w:r>
+      <w:r>
+        <w:t xml:space="preserve"> </w:t>
+      </w:r>
+      <w:r>
+        <w:t xml:space="preserve">avec utilisation d’artéfacts Agiles (Sprints, Backlog).</w:t>
+      </w:r>
+    </w:p>
+    <w:p>
+      <w:pPr>
+        <w:pStyle w:val="Compact"/>
+        <w:numPr>
+          <w:ilvl w:val="0"/>
+          <w:numId w:val="1019"/>
+        </w:numPr>
+      </w:pPr>
+      <w:r>
+        <w:rPr>
+          <w:b/>
+          <w:bCs/>
+        </w:rPr>
+        <w:t xml:space="preserve">Conception :</w:t>
+      </w:r>
+      <w:r>
+        <w:t xml:space="preserve"> </w:t>
+      </w:r>
+      <w:r>
+        <w:t xml:space="preserve">PlantUML pour les diagrammes de cas d’utilisation et de classe.</w:t>
+      </w:r>
+    </w:p>
+    <w:p>
+      <w:r>
+        <w:br w:type="page"/>
+      </w:r>
+    </w:p>
+    <w:bookmarkEnd w:id="107"/>
+    <w:bookmarkEnd w:id="108"/>
+    <w:bookmarkStart w:id="109" w:name="conclusion"/>
+    <w:p>
+      <w:pPr>
+        <w:pStyle w:val="Heading1"/>
+      </w:pPr>
+      <w:r>
+        <w:rPr>
+          <w:rStyle w:val="SectionNumber"/>
+        </w:rPr>
+        <w:t xml:space="preserve">11</w:t>
+      </w:r>
+      <w:r>
+        <w:tab/>
+      </w:r>
+      <w:r>
+        <w:t xml:space="preserve">⭐ Conclusion</w:t>
+      </w:r>
+    </w:p>
+    <w:p>
+      <w:pPr>
+        <w:pStyle w:val="FirstParagraph"/>
+      </w:pPr>
+      <w:r>
+        <w:t xml:space="preserve">Le projet</w:t>
+      </w:r>
+      <w:r>
+        <w:t xml:space="preserve"> </w:t>
+      </w:r>
+      <w:r>
+        <w:rPr>
+          <w:b/>
+          <w:bCs/>
+        </w:rPr>
+        <w:t xml:space="preserve">AttendanceFlow-AMS</w:t>
+      </w:r>
+      <w:r>
+        <w:t xml:space="preserve"> </w:t>
+      </w:r>
+      <w:r>
+        <w:t xml:space="preserve">a permis de répondre efficacement aux défis de la gestion des absences au sein de</w:t>
+      </w:r>
+      <w:r>
+        <w:t xml:space="preserve"> </w:t>
+      </w:r>
+      <w:r>
+        <w:rPr>
+          <w:b/>
+          <w:bCs/>
+        </w:rPr>
+        <w:t xml:space="preserve">SoliCode</w:t>
+      </w:r>
+      <w:r>
+        <w:t xml:space="preserve">. En remplaçant les processus manuels par une solution numérique intégrée (Web &amp; Mobile), nous avons atteint les objectifs de :</w:t>
+      </w:r>
+    </w:p>
+    <w:p>
+      <w:pPr>
+        <w:pStyle w:val="Compact"/>
+        <w:numPr>
+          <w:ilvl w:val="0"/>
+          <w:numId w:val="1020"/>
+        </w:numPr>
+      </w:pPr>
+      <w:r>
+        <w:rPr>
+          <w:b/>
+          <w:bCs/>
+        </w:rPr>
+        <w:t xml:space="preserve">Fiabilité :</w:t>
+      </w:r>
+      <w:r>
+        <w:t xml:space="preserve"> </w:t>
+      </w:r>
+      <w:r>
+        <w:t xml:space="preserve">Suppression des erreurs de saisie et centralisation de l’information.</w:t>
+      </w:r>
+    </w:p>
+    <w:p>
+      <w:pPr>
+        <w:pStyle w:val="Compact"/>
+        <w:numPr>
+          <w:ilvl w:val="0"/>
+          <w:numId w:val="1020"/>
+        </w:numPr>
+      </w:pPr>
+      <w:r>
+        <w:rPr>
+          <w:b/>
+          <w:bCs/>
+        </w:rPr>
+        <w:t xml:space="preserve">Productivité :</w:t>
+      </w:r>
+      <w:r>
+        <w:t xml:space="preserve"> </w:t>
+      </w:r>
+      <w:r>
+        <w:t xml:space="preserve">Gain de temps significatif pour les formateurs et l’administration.</w:t>
+      </w:r>
+    </w:p>
+    <w:p>
+      <w:pPr>
+        <w:pStyle w:val="Compact"/>
+        <w:numPr>
+          <w:ilvl w:val="0"/>
+          <w:numId w:val="1020"/>
+        </w:numPr>
+      </w:pPr>
+      <w:r>
+        <w:rPr>
+          <w:b/>
+          <w:bCs/>
+        </w:rPr>
         <w:t xml:space="preserve">Transparence :</w:t>
       </w:r>
       <w:r>
@@ -4920,7 +5074,7 @@
         <w:t xml:space="preserve">Cette expérience a été l’occasion de mettre en œuvre des méthodologies agiles (Scrum, Design Thinking) et des technologies de pointe (Laravel, Tailwind CSS). Les perspectives d’évolution incluent l’intégration de notifications automatisées et l’analyse prédictive pour lutter contre le décrochage scolaire.</w:t>
       </w:r>
     </w:p>
-    <w:bookmarkEnd w:id="107"/>
+    <w:bookmarkEnd w:id="109"/>
     <w:sectPr>
       <w:footnotePr>
         <w:numRestart w:val="eachSect"/>
@@ -5295,7 +5449,34 @@
     <w:abstractNumId w:val="991"/>
   </w:num>
   <w:num w:numId="1016">
-    <w:abstractNumId w:val="991"/>
+    <w:abstractNumId w:val="99411"/>
+    <w:lvlOverride w:ilvl="0">
+      <w:startOverride w:val="1"/>
+    </w:lvlOverride>
+    <w:lvlOverride w:ilvl="1">
+      <w:startOverride w:val="1"/>
+    </w:lvlOverride>
+    <w:lvlOverride w:ilvl="2">
+      <w:startOverride w:val="1"/>
+    </w:lvlOverride>
+    <w:lvlOverride w:ilvl="3">
+      <w:startOverride w:val="1"/>
+    </w:lvlOverride>
+    <w:lvlOverride w:ilvl="4">
+      <w:startOverride w:val="1"/>
+    </w:lvlOverride>
+    <w:lvlOverride w:ilvl="5">
+      <w:startOverride w:val="1"/>
+    </w:lvlOverride>
+    <w:lvlOverride w:ilvl="6">
+      <w:startOverride w:val="1"/>
+    </w:lvlOverride>
+    <w:lvlOverride w:ilvl="7">
+      <w:startOverride w:val="1"/>
+    </w:lvlOverride>
+    <w:lvlOverride w:ilvl="8">
+      <w:startOverride w:val="1"/>
+    </w:lvlOverride>
   </w:num>
   <w:num w:numId="1017">
     <w:abstractNumId w:val="991"/>
@@ -5304,6 +5485,9 @@
     <w:abstractNumId w:val="991"/>
   </w:num>
   <w:num w:numId="1019">
+    <w:abstractNumId w:val="991"/>
+  </w:num>
+  <w:num w:numId="1020">
     <w:abstractNumId w:val="99411"/>
     <w:lvlOverride w:ilvl="0">
       <w:startOverride w:val="1"/>

</xml_diff>